<commit_message>
[DOCS] Corregir apartado 4: endif y for en filas separadas en tabla condicional
</commit_message>
<xml_diff>
--- a/docs/supervisor/plantilla_ejemplo.docx
+++ b/docs/supervisor/plantilla_ejemplo.docx
@@ -669,7 +669,35 @@
           </w:tcPr>
           <w:p>
             <w:r>
-              <w:t>{%tr endif %} — {%tr for row in organismos_consultados %}</w:t>
+              <w:t>{%tr endif %}</w:t>
+            </w:r>
+          </w:p>
+        </w:tc>
+        <w:tc>
+          <w:tcPr>
+            <w:tcW w:type="dxa" w:w="2880"/>
+          </w:tcPr>
+          <w:p>
+            <w:r/>
+          </w:p>
+        </w:tc>
+        <w:tc>
+          <w:tcPr>
+            <w:tcW w:type="dxa" w:w="2880"/>
+          </w:tcPr>
+          <w:p>
+            <w:r/>
+          </w:p>
+        </w:tc>
+      </w:tr>
+      <w:tr>
+        <w:tc>
+          <w:tcPr>
+            <w:tcW w:type="dxa" w:w="2880"/>
+          </w:tcPr>
+          <w:p>
+            <w:r>
+              <w:t>{%tr for row in organismos_consultados %}</w:t>
             </w:r>
           </w:p>
         </w:tc>
@@ -787,7 +815,7 @@
         <w:rPr>
           <w:b w:val="0"/>
         </w:rPr>
-        <w:t>Crea UN párrafo con estilo de lista (viñeta o numerada) y escribe el bucle dentro. El sistema replica ese párrafo con su estilo para cada elemento.</w:t>
+        <w:t>Crea UN párrafo con estilo de lista y escribe el bucle dentro. El sistema replica ese párrafo con su estilo para cada elemento.</w:t>
       </w:r>
     </w:p>
     <w:p/>
@@ -1082,7 +1110,7 @@
         <w:rPr>
           <w:b w:val="0"/>
         </w:rPr>
-        <w:t>Un fragmento es un .docx independiente que se inserta en ese punto. Útil para cláusulas legales o membretes que se reutilizan en varias plantillas.</w:t>
+        <w:t>Un fragmento es un .docx independiente que se inserta en ese punto. Útil para cláusulas legales o membretes reutilizables en varias plantillas.</w:t>
       </w:r>
     </w:p>
     <w:p/>

</xml_diff>